<commit_message>
ajustes finais para entrega do projeto mvp1
</commit_message>
<xml_diff>
--- a/doc/Projeto-PosFiap-App_Imesa.docx
+++ b/doc/Projeto-PosFiap-App_Imesa.docx
@@ -415,6 +415,9 @@
     </w:p>
     <w:p>
       <w:r>
+        <w:rPr>
+          <w:noProof/>
+        </w:rPr>
         <w:drawing>
           <wp:inline distT="0" distB="0" distL="0" distR="0" wp14:anchorId="51971312" wp14:editId="5B763B33">
             <wp:extent cx="5400040" cy="4164965"/>
@@ -472,8 +475,11 @@
     </w:p>
     <w:p>
       <w:r>
+        <w:rPr>
+          <w:noProof/>
+        </w:rPr>
         <w:drawing>
-          <wp:inline distT="0" distB="0" distL="0" distR="0" wp14:anchorId="3717BB51" wp14:editId="217E44E6">
+          <wp:inline distT="0" distB="0" distL="0" distR="0" wp14:anchorId="3717BB51" wp14:editId="2FFFDB5D">
             <wp:extent cx="5400040" cy="3896995"/>
             <wp:effectExtent l="0" t="0" r="0" b="8255"/>
             <wp:docPr id="1322227694" name="Imagem 2" descr="Diagrama&#10;&#10;O conteúdo gerado por IA pode estar incorreto."/>
@@ -692,13 +698,8 @@
             <w:tcW w:w="6939" w:type="dxa"/>
           </w:tcPr>
           <w:p>
-            <w:proofErr w:type="gramStart"/>
-            <w:r>
-              <w:t>Criar um novo</w:t>
-            </w:r>
-            <w:proofErr w:type="gramEnd"/>
-            <w:r>
-              <w:t xml:space="preserve"> </w:t>
+            <w:r>
+              <w:t xml:space="preserve">Criar um novo </w:t>
             </w:r>
             <w:r>
               <w:t>Usuário</w:t>
@@ -838,15 +839,7 @@
             </w:r>
             <w:r>
               <w:tab/>
-              <w:t>"</w:t>
-            </w:r>
-            <w:proofErr w:type="gramStart"/>
-            <w:r>
-              <w:t>numero</w:t>
-            </w:r>
-            <w:proofErr w:type="gramEnd"/>
-            <w:r>
-              <w:t>": "993",</w:t>
+              <w:t>"numero": "993",</w:t>
             </w:r>
           </w:p>
           <w:p>
@@ -1561,15 +1554,7 @@
             </w:r>
             <w:r>
               <w:tab/>
-              <w:t>"</w:t>
-            </w:r>
-            <w:proofErr w:type="gramStart"/>
-            <w:r>
-              <w:t>numero</w:t>
-            </w:r>
-            <w:proofErr w:type="gramEnd"/>
-            <w:r>
-              <w:t>": "993",</w:t>
+              <w:t>"numero": "993",</w:t>
             </w:r>
           </w:p>
           <w:p>
@@ -3172,12 +3157,10 @@
         <w:t xml:space="preserve"> Em nosso caso deixamos comentado apenas para quando for testar não ficar consumindo espaço da </w:t>
       </w:r>
       <w:proofErr w:type="spellStart"/>
-      <w:proofErr w:type="gramStart"/>
       <w:r>
         <w:t>maquina</w:t>
       </w:r>
       <w:proofErr w:type="spellEnd"/>
-      <w:proofErr w:type="gramEnd"/>
       <w:r>
         <w:t xml:space="preserve"> quando o container for destruído.</w:t>
       </w:r>
@@ -3220,13 +3203,8 @@
         <w:t>context</w:t>
       </w:r>
       <w:proofErr w:type="spellEnd"/>
-      <w:proofErr w:type="gramStart"/>
-      <w:r>
-        <w:t>: .</w:t>
-      </w:r>
-      <w:proofErr w:type="gramEnd"/>
-      <w:r>
-        <w:t>).</w:t>
+      <w:r>
+        <w:t>: .).</w:t>
       </w:r>
     </w:p>
     <w:p>
@@ -3438,7 +3416,10 @@
       </w:r>
       <w:proofErr w:type="spellEnd"/>
       <w:r>
-        <w:t xml:space="preserve"> clone https://github.com/inisap/pos-fiap-imesa</w:t>
+        <w:t xml:space="preserve"> clone </w:t>
+      </w:r>
+      <w:r>
+        <w:t>https://github.com/inisap/pos-fiap-imesa/tree/release-candidate-0.0.1</w:t>
       </w:r>
       <w:r>
         <w:br/>
@@ -4017,59 +3998,50 @@
         </w:rPr>
         <w:t xml:space="preserve"> </w:t>
       </w:r>
+      <w:r>
+        <w:t>https://github.com/inisap/pos-fiap-imesa/tree/release-candidate-0.0.1/doc</w:t>
+      </w:r>
+    </w:p>
+    <w:p>
+      <w:r>
+        <w:br/>
+        <w:t xml:space="preserve">Para importar a </w:t>
+      </w:r>
+      <w:proofErr w:type="spellStart"/>
+      <w:r>
+        <w:t>collection</w:t>
+      </w:r>
+      <w:proofErr w:type="spellEnd"/>
+      <w:r>
+        <w:t>:</w:t>
+      </w:r>
+    </w:p>
+    <w:p>
+      <w:r>
+        <w:t>Aces</w:t>
+      </w:r>
+      <w:r>
+        <w:t xml:space="preserve">se o </w:t>
+      </w:r>
+      <w:proofErr w:type="spellStart"/>
+      <w:r>
+        <w:t>repositorio</w:t>
+      </w:r>
+      <w:proofErr w:type="spellEnd"/>
+      <w:r>
+        <w:t xml:space="preserve">: </w:t>
+      </w:r>
       <w:hyperlink r:id="rId15" w:history="1">
         <w:r>
           <w:rPr>
             <w:rStyle w:val="Hyperlink"/>
           </w:rPr>
-          <w:t>https://github.com/inisap/pos-fiap-imesa/tree/main/doc</w:t>
+          <w:t>https://github.com/inisap/pos-fiap-imesa/blob/release-candidate-0.0.1/doc/Post%20Tech%20Fiap%20Imesa.postman_collection.json</w:t>
         </w:r>
       </w:hyperlink>
       <w:r>
-        <w:rPr>
-          <w:b/>
-          <w:bCs/>
-        </w:rPr>
         <w:t xml:space="preserve"> </w:t>
       </w:r>
-    </w:p>
-    <w:p>
-      <w:r>
-        <w:br/>
-        <w:t xml:space="preserve">Para importar a </w:t>
-      </w:r>
-      <w:proofErr w:type="spellStart"/>
-      <w:r>
-        <w:t>collection</w:t>
-      </w:r>
-      <w:proofErr w:type="spellEnd"/>
-      <w:r>
-        <w:t>:</w:t>
-      </w:r>
-    </w:p>
-    <w:p>
-      <w:r>
-        <w:t>Aces</w:t>
-      </w:r>
-      <w:r>
-        <w:t xml:space="preserve">se o </w:t>
-      </w:r>
-      <w:proofErr w:type="spellStart"/>
-      <w:r>
-        <w:t>repositorio</w:t>
-      </w:r>
-      <w:proofErr w:type="spellEnd"/>
-      <w:r>
-        <w:t xml:space="preserve">: </w:t>
-      </w:r>
-      <w:hyperlink r:id="rId16" w:history="1">
-        <w:r>
-          <w:rPr>
-            <w:rStyle w:val="Hyperlink"/>
-          </w:rPr>
-          <w:t>https://github.com/inisap/pos-fiap-imesa/tree/main/doc</w:t>
-        </w:r>
-      </w:hyperlink>
     </w:p>
     <w:p>
       <w:pPr>
@@ -4136,17 +4108,9 @@
         <w:rPr>
           <w:lang w:val="en-US"/>
         </w:rPr>
-        <w:t>Imesa.postman_</w:t>
-      </w:r>
-      <w:proofErr w:type="gramStart"/>
-      <w:r>
-        <w:rPr>
-          <w:lang w:val="en-US"/>
-        </w:rPr>
-        <w:t>collection.json</w:t>
+        <w:t>Imesa.postman_collection.json</w:t>
       </w:r>
       <w:proofErr w:type="spellEnd"/>
-      <w:proofErr w:type="gramEnd"/>
       <w:r>
         <w:rPr>
           <w:lang w:val="en-US"/>
@@ -4191,6 +4155,9 @@
         <w:br/>
       </w:r>
       <w:r>
+        <w:rPr>
+          <w:noProof/>
+        </w:rPr>
         <w:drawing>
           <wp:inline distT="0" distB="0" distL="0" distR="0" wp14:anchorId="013F0820" wp14:editId="6A96DD93">
             <wp:extent cx="5400040" cy="3181985"/>
@@ -4207,7 +4174,7 @@
                     <pic:cNvPicPr/>
                   </pic:nvPicPr>
                   <pic:blipFill>
-                    <a:blip r:embed="rId17"/>
+                    <a:blip r:embed="rId16"/>
                     <a:stretch>
                       <a:fillRect/>
                     </a:stretch>
@@ -4245,6 +4212,9 @@
     </w:p>
     <w:p>
       <w:r>
+        <w:rPr>
+          <w:noProof/>
+        </w:rPr>
         <w:drawing>
           <wp:inline distT="0" distB="0" distL="0" distR="0" wp14:anchorId="5CDEC541" wp14:editId="1FEE5D1A">
             <wp:extent cx="5400040" cy="3201035"/>
@@ -4261,7 +4231,7 @@
                     <pic:cNvPicPr/>
                   </pic:nvPicPr>
                   <pic:blipFill>
-                    <a:blip r:embed="rId18"/>
+                    <a:blip r:embed="rId17"/>
                     <a:stretch>
                       <a:fillRect/>
                     </a:stretch>
@@ -4315,6 +4285,9 @@
         <w:br/>
       </w:r>
       <w:r>
+        <w:rPr>
+          <w:noProof/>
+        </w:rPr>
         <w:drawing>
           <wp:inline distT="0" distB="0" distL="0" distR="0" wp14:anchorId="28944B42" wp14:editId="1D9F6D9D">
             <wp:extent cx="5400040" cy="6125210"/>
@@ -4331,7 +4304,7 @@
                     <pic:cNvPicPr/>
                   </pic:nvPicPr>
                   <pic:blipFill>
-                    <a:blip r:embed="rId19"/>
+                    <a:blip r:embed="rId18"/>
                     <a:stretch>
                       <a:fillRect/>
                     </a:stretch>
@@ -4354,6 +4327,9 @@
     </w:p>
     <w:p>
       <w:r>
+        <w:rPr>
+          <w:noProof/>
+        </w:rPr>
         <w:lastRenderedPageBreak/>
         <w:drawing>
           <wp:inline distT="0" distB="0" distL="0" distR="0" wp14:anchorId="21F8D2AD" wp14:editId="48279F66">
@@ -4371,7 +4347,7 @@
                     <pic:cNvPicPr/>
                   </pic:nvPicPr>
                   <pic:blipFill>
-                    <a:blip r:embed="rId20"/>
+                    <a:blip r:embed="rId19"/>
                     <a:stretch>
                       <a:fillRect/>
                     </a:stretch>
@@ -4412,23 +4388,7 @@
           <w:b/>
           <w:bCs/>
         </w:rPr>
-        <w:t xml:space="preserve">Observação: para facilitar os testes, foram criados cada um </w:t>
-      </w:r>
-      <w:proofErr w:type="gramStart"/>
-      <w:r>
-        <w:rPr>
-          <w:b/>
-          <w:bCs/>
-        </w:rPr>
-        <w:t>dos cenário</w:t>
-      </w:r>
-      <w:proofErr w:type="gramEnd"/>
-      <w:r>
-        <w:rPr>
-          <w:b/>
-          <w:bCs/>
-        </w:rPr>
-        <w:t xml:space="preserve"> com os </w:t>
+        <w:t xml:space="preserve">Observação: para facilitar os testes, foram criados cada um dos cenário com os </w:t>
       </w:r>
       <w:proofErr w:type="spellStart"/>
       <w:r>
@@ -4476,7 +4436,6 @@
         <w:t xml:space="preserve">Outro ponto ativei o servisse de </w:t>
       </w:r>
       <w:proofErr w:type="spellStart"/>
-      <w:proofErr w:type="gramStart"/>
       <w:r>
         <w:rPr>
           <w:b/>
@@ -4501,7 +4460,6 @@
         <w:t>create</w:t>
       </w:r>
       <w:proofErr w:type="spellEnd"/>
-      <w:proofErr w:type="gramEnd"/>
       <w:r>
         <w:rPr>
           <w:b/>
@@ -4694,23 +4652,7 @@
                 <w:b/>
                 <w:bCs/>
               </w:rPr>
-              <w:t xml:space="preserve"> </w:t>
-            </w:r>
-            <w:proofErr w:type="gramStart"/>
-            <w:r>
-              <w:rPr>
-                <w:b/>
-                <w:bCs/>
-              </w:rPr>
-              <w:t>por Criar</w:t>
-            </w:r>
-            <w:proofErr w:type="gramEnd"/>
-            <w:r>
-              <w:rPr>
-                <w:b/>
-                <w:bCs/>
-              </w:rPr>
-              <w:t xml:space="preserve"> um novo </w:t>
+              <w:t xml:space="preserve"> por Criar um novo </w:t>
             </w:r>
             <w:proofErr w:type="spellStart"/>
             <w:r>
@@ -4926,15 +4868,7 @@
             </w:r>
             <w:r>
               <w:tab/>
-              <w:t>"</w:t>
-            </w:r>
-            <w:proofErr w:type="gramStart"/>
-            <w:r>
-              <w:t>numero</w:t>
-            </w:r>
-            <w:proofErr w:type="gramEnd"/>
-            <w:r>
-              <w:t>": "993",</w:t>
+              <w:t>"numero": "993",</w:t>
             </w:r>
           </w:p>
           <w:p>
@@ -5153,16 +5087,8 @@
               <w:rPr>
                 <w:lang w:val="en-US"/>
               </w:rPr>
-              <w:t xml:space="preserve">  --</w:t>
-            </w:r>
-            <w:proofErr w:type="gramStart"/>
-            <w:r>
-              <w:rPr>
-                <w:lang w:val="en-US"/>
-              </w:rPr>
-              <w:t>data '{</w:t>
-            </w:r>
-            <w:proofErr w:type="gramEnd"/>
+              <w:t xml:space="preserve">  --data '{</w:t>
+            </w:r>
           </w:p>
           <w:p>
             <w:pPr>
@@ -5641,15 +5567,7 @@
             </w:r>
             <w:r>
               <w:tab/>
-              <w:t>"</w:t>
-            </w:r>
-            <w:proofErr w:type="gramStart"/>
-            <w:r>
-              <w:t>numero</w:t>
-            </w:r>
-            <w:proofErr w:type="gramEnd"/>
-            <w:r>
-              <w:t>": "993",</w:t>
+              <w:t>"numero": "993",</w:t>
             </w:r>
           </w:p>
           <w:p>
@@ -5791,23 +5709,7 @@
                 <w:b/>
                 <w:bCs/>
               </w:rPr>
-              <w:t xml:space="preserve"> </w:t>
-            </w:r>
-            <w:proofErr w:type="gramStart"/>
-            <w:r>
-              <w:rPr>
-                <w:b/>
-                <w:bCs/>
-              </w:rPr>
-              <w:t>por Consultar</w:t>
-            </w:r>
-            <w:proofErr w:type="gramEnd"/>
-            <w:r>
-              <w:rPr>
-                <w:b/>
-                <w:bCs/>
-              </w:rPr>
-              <w:t xml:space="preserve"> os dados de um </w:t>
+              <w:t xml:space="preserve"> por Consultar os dados de um </w:t>
             </w:r>
             <w:proofErr w:type="spellStart"/>
             <w:r>
@@ -6143,23 +6045,7 @@
                 <w:b/>
                 <w:bCs/>
               </w:rPr>
-              <w:t xml:space="preserve"> </w:t>
-            </w:r>
-            <w:proofErr w:type="gramStart"/>
-            <w:r>
-              <w:rPr>
-                <w:b/>
-                <w:bCs/>
-              </w:rPr>
-              <w:t>por Deletar</w:t>
-            </w:r>
-            <w:proofErr w:type="gramEnd"/>
-            <w:r>
-              <w:rPr>
-                <w:b/>
-                <w:bCs/>
-              </w:rPr>
-              <w:t xml:space="preserve"> um </w:t>
+              <w:t xml:space="preserve"> por Deletar um </w:t>
             </w:r>
             <w:proofErr w:type="spellStart"/>
             <w:r>
@@ -6409,15 +6295,7 @@
               <w:t>responsável</w:t>
             </w:r>
             <w:r>
-              <w:t xml:space="preserve"> </w:t>
-            </w:r>
-            <w:proofErr w:type="gramStart"/>
-            <w:r>
-              <w:t>por Criar</w:t>
-            </w:r>
-            <w:proofErr w:type="gramEnd"/>
-            <w:r>
-              <w:t xml:space="preserve"> um novo </w:t>
+              <w:t xml:space="preserve"> por Criar um novo </w:t>
             </w:r>
             <w:r>
               <w:t>Usuário</w:t>
@@ -6568,107 +6446,127 @@
             </w:r>
             <w:r>
               <w:tab/>
+              <w:t>"numero": "993",</w:t>
+            </w:r>
+          </w:p>
+          <w:p>
+            <w:r>
+              <w:tab/>
+            </w:r>
+            <w:r>
+              <w:tab/>
+              <w:t>"complemento": "casa 2",</w:t>
+            </w:r>
+          </w:p>
+          <w:p>
+            <w:r>
+              <w:tab/>
+            </w:r>
+            <w:r>
+              <w:tab/>
+              <w:t>"cep": "06364550",</w:t>
+            </w:r>
+          </w:p>
+          <w:p>
+            <w:r>
+              <w:tab/>
+            </w:r>
+            <w:r>
+              <w:tab/>
+              <w:t>"cidade": "Carapicuiba",</w:t>
+            </w:r>
+          </w:p>
+          <w:p>
+            <w:r>
+              <w:tab/>
+            </w:r>
+            <w:r>
+              <w:tab/>
               <w:t>"</w:t>
             </w:r>
-            <w:proofErr w:type="gramStart"/>
-            <w:r>
-              <w:t>numero</w:t>
-            </w:r>
-            <w:proofErr w:type="gramEnd"/>
-            <w:r>
-              <w:t>": "993",</w:t>
-            </w:r>
-          </w:p>
-          <w:p>
-            <w:r>
-              <w:tab/>
-            </w:r>
-            <w:r>
-              <w:tab/>
-              <w:t>"complemento": "casa 2",</w:t>
-            </w:r>
-          </w:p>
-          <w:p>
-            <w:r>
-              <w:tab/>
-            </w:r>
-            <w:r>
-              <w:tab/>
-              <w:t>"cep": "06364550",</w:t>
-            </w:r>
-          </w:p>
-          <w:p>
-            <w:r>
-              <w:tab/>
-            </w:r>
-            <w:r>
-              <w:tab/>
-              <w:t>"cidade": "Carapicuiba",</w:t>
-            </w:r>
-          </w:p>
-          <w:p>
-            <w:r>
-              <w:tab/>
-            </w:r>
+            <w:proofErr w:type="spellStart"/>
+            <w:r>
+              <w:t>bairro":"Jardim</w:t>
+            </w:r>
+            <w:proofErr w:type="spellEnd"/>
+            <w:r>
+              <w:t xml:space="preserve"> Ana Estela",</w:t>
+            </w:r>
+          </w:p>
+          <w:p>
+            <w:r>
+              <w:tab/>
+            </w:r>
+            <w:r>
+              <w:tab/>
+              <w:t>"estado": "São Paulo"</w:t>
+            </w:r>
+          </w:p>
+          <w:p>
+            <w:r>
+              <w:tab/>
+              <w:t>}</w:t>
+            </w:r>
+          </w:p>
+          <w:p>
+            <w:r>
+              <w:t>}</w:t>
+            </w:r>
+          </w:p>
+        </w:tc>
+      </w:tr>
+      <w:tr>
+        <w:tc>
+          <w:tcPr>
+            <w:tcW w:w="2689" w:type="dxa"/>
+          </w:tcPr>
+          <w:p>
+            <w:r>
+              <w:t>Retorno esperado</w:t>
+            </w:r>
+          </w:p>
+        </w:tc>
+        <w:tc>
+          <w:tcPr>
+            <w:tcW w:w="5805" w:type="dxa"/>
+          </w:tcPr>
+          <w:p>
+            <w:r>
+              <w:t>{</w:t>
+            </w:r>
+          </w:p>
+          <w:p>
+            <w:r>
+              <w:tab/>
+              <w:t>"nome": "Diego Pasini",</w:t>
+            </w:r>
+          </w:p>
+          <w:p>
             <w:r>
               <w:tab/>
               <w:t>"</w:t>
             </w:r>
             <w:proofErr w:type="spellStart"/>
             <w:r>
-              <w:t>bairro":"Jardim</w:t>
-            </w:r>
-            <w:proofErr w:type="spellEnd"/>
-            <w:r>
-              <w:t xml:space="preserve"> Ana Estela",</w:t>
-            </w:r>
-          </w:p>
-          <w:p>
-            <w:r>
-              <w:tab/>
-            </w:r>
-            <w:r>
-              <w:tab/>
-              <w:t>"estado": "São Paulo"</w:t>
-            </w:r>
-          </w:p>
-          <w:p>
-            <w:r>
-              <w:tab/>
-              <w:t>}</w:t>
-            </w:r>
-          </w:p>
-          <w:p>
-            <w:r>
-              <w:t>}</w:t>
-            </w:r>
-          </w:p>
-        </w:tc>
-      </w:tr>
-      <w:tr>
-        <w:tc>
-          <w:tcPr>
-            <w:tcW w:w="2689" w:type="dxa"/>
-          </w:tcPr>
-          <w:p>
-            <w:r>
-              <w:t>Retorno esperado</w:t>
-            </w:r>
-          </w:p>
-        </w:tc>
-        <w:tc>
-          <w:tcPr>
-            <w:tcW w:w="5805" w:type="dxa"/>
-          </w:tcPr>
-          <w:p>
-            <w:r>
-              <w:t>{</w:t>
-            </w:r>
-          </w:p>
-          <w:p>
-            <w:r>
-              <w:tab/>
-              <w:t>"nome": "Diego Pasini",</w:t>
+              <w:t>email</w:t>
+            </w:r>
+            <w:proofErr w:type="spellEnd"/>
+            <w:r>
+              <w:t>": "diego_t_pasini@hotmail.com",</w:t>
+            </w:r>
+          </w:p>
+          <w:p>
+            <w:r>
+              <w:tab/>
+              <w:t>"login": "</w:t>
+            </w:r>
+            <w:proofErr w:type="spellStart"/>
+            <w:r>
+              <w:t>pasini</w:t>
+            </w:r>
+            <w:proofErr w:type="spellEnd"/>
+            <w:r>
+              <w:t>",</w:t>
             </w:r>
           </w:p>
           <w:p>
@@ -6678,25 +6576,11 @@
             </w:r>
             <w:proofErr w:type="spellStart"/>
             <w:r>
-              <w:t>email</w:t>
-            </w:r>
-            <w:proofErr w:type="spellEnd"/>
-            <w:r>
-              <w:t>": "diego_t_pasini@hotmail.com",</w:t>
-            </w:r>
-          </w:p>
-          <w:p>
-            <w:r>
-              <w:tab/>
-              <w:t>"login": "</w:t>
-            </w:r>
-            <w:proofErr w:type="spellStart"/>
-            <w:r>
-              <w:t>pasini</w:t>
-            </w:r>
-            <w:proofErr w:type="spellEnd"/>
-            <w:r>
-              <w:t>",</w:t>
+              <w:t>password</w:t>
+            </w:r>
+            <w:proofErr w:type="spellEnd"/>
+            <w:r>
+              <w:t>": "pasini123",</w:t>
             </w:r>
           </w:p>
           <w:p>
@@ -6706,11 +6590,11 @@
             </w:r>
             <w:proofErr w:type="spellStart"/>
             <w:r>
-              <w:t>password</w:t>
-            </w:r>
-            <w:proofErr w:type="spellEnd"/>
-            <w:r>
-              <w:t>": "pasini123",</w:t>
+              <w:t>tipoUsuario</w:t>
+            </w:r>
+            <w:proofErr w:type="spellEnd"/>
+            <w:r>
+              <w:t>": "CLIENTE",</w:t>
             </w:r>
           </w:p>
           <w:p>
@@ -6720,20 +6604,6 @@
             </w:r>
             <w:proofErr w:type="spellStart"/>
             <w:r>
-              <w:t>tipoUsuario</w:t>
-            </w:r>
-            <w:proofErr w:type="spellEnd"/>
-            <w:r>
-              <w:t>": "CLIENTE",</w:t>
-            </w:r>
-          </w:p>
-          <w:p>
-            <w:r>
-              <w:tab/>
-              <w:t>"</w:t>
-            </w:r>
-            <w:proofErr w:type="spellStart"/>
-            <w:r>
               <w:t>endereco</w:t>
             </w:r>
             <w:proofErr w:type="spellEnd"/>
@@ -6764,15 +6634,7 @@
             </w:r>
             <w:r>
               <w:tab/>
-              <w:t>"</w:t>
-            </w:r>
-            <w:proofErr w:type="gramStart"/>
-            <w:r>
-              <w:t>numero</w:t>
-            </w:r>
-            <w:proofErr w:type="gramEnd"/>
-            <w:r>
-              <w:t>": "993",</w:t>
+              <w:t>"numero": "993",</w:t>
             </w:r>
           </w:p>
           <w:p>
@@ -6945,152 +6807,161 @@
                 <w:b/>
                 <w:bCs/>
               </w:rPr>
-              <w:t xml:space="preserve"> com </w:t>
-            </w:r>
-            <w:proofErr w:type="gramStart"/>
-            <w:r>
-              <w:rPr>
-                <w:b/>
-                <w:bCs/>
-              </w:rPr>
-              <w:t>o mesmo</w:t>
-            </w:r>
-            <w:proofErr w:type="gramEnd"/>
-            <w:r>
-              <w:rPr>
-                <w:b/>
-                <w:bCs/>
-              </w:rPr>
+              <w:t xml:space="preserve"> com o mesmo </w:t>
+            </w:r>
+            <w:proofErr w:type="spellStart"/>
+            <w:r>
+              <w:rPr>
+                <w:b/>
+                <w:bCs/>
+              </w:rPr>
+              <w:t>email</w:t>
+            </w:r>
+            <w:proofErr w:type="spellEnd"/>
+          </w:p>
+        </w:tc>
+      </w:tr>
+      <w:tr>
+        <w:tc>
+          <w:tcPr>
+            <w:tcW w:w="2689" w:type="dxa"/>
+          </w:tcPr>
+          <w:p>
+            <w:r>
+              <w:t xml:space="preserve">Chamar o </w:t>
+            </w:r>
+            <w:proofErr w:type="spellStart"/>
+            <w:r>
+              <w:t>Endpoint</w:t>
+            </w:r>
+            <w:proofErr w:type="spellEnd"/>
+          </w:p>
+        </w:tc>
+        <w:tc>
+          <w:tcPr>
+            <w:tcW w:w="5805" w:type="dxa"/>
+          </w:tcPr>
+          <w:p>
+            <w:r>
+              <w:t xml:space="preserve">[1] </w:t>
+            </w:r>
+            <w:proofErr w:type="spellStart"/>
+            <w:r>
+              <w:t>Endpoint</w:t>
+            </w:r>
+            <w:proofErr w:type="spellEnd"/>
+            <w:r>
               <w:t xml:space="preserve"> </w:t>
             </w:r>
             <w:proofErr w:type="spellStart"/>
             <w:r>
-              <w:rPr>
-                <w:b/>
-                <w:bCs/>
-              </w:rPr>
+              <w:t>responsavel</w:t>
+            </w:r>
+            <w:proofErr w:type="spellEnd"/>
+            <w:r>
+              <w:t xml:space="preserve"> por Criar um novo </w:t>
+            </w:r>
+            <w:proofErr w:type="spellStart"/>
+            <w:r>
+              <w:t>Usuario</w:t>
+            </w:r>
+            <w:proofErr w:type="spellEnd"/>
+          </w:p>
+        </w:tc>
+      </w:tr>
+      <w:tr>
+        <w:tc>
+          <w:tcPr>
+            <w:tcW w:w="2689" w:type="dxa"/>
+          </w:tcPr>
+          <w:p>
+            <w:r>
+              <w:t>Descrição</w:t>
+            </w:r>
+          </w:p>
+        </w:tc>
+        <w:tc>
+          <w:tcPr>
+            <w:tcW w:w="5805" w:type="dxa"/>
+          </w:tcPr>
+          <w:p>
+            <w:r>
+              <w:t>Tentar inserir 2</w:t>
+            </w:r>
+            <w:r>
+              <w:t>x</w:t>
+            </w:r>
+            <w:r>
+              <w:t xml:space="preserve"> </w:t>
+            </w:r>
+            <w:r>
+              <w:t>o mesmo e-mail</w:t>
+            </w:r>
+          </w:p>
+        </w:tc>
+      </w:tr>
+      <w:tr>
+        <w:tc>
+          <w:tcPr>
+            <w:tcW w:w="2689" w:type="dxa"/>
+          </w:tcPr>
+          <w:p>
+            <w:proofErr w:type="spellStart"/>
+            <w:r>
+              <w:t>Payload</w:t>
+            </w:r>
+            <w:proofErr w:type="spellEnd"/>
+          </w:p>
+        </w:tc>
+        <w:tc>
+          <w:tcPr>
+            <w:tcW w:w="5805" w:type="dxa"/>
+          </w:tcPr>
+          <w:p>
+            <w:r>
+              <w:t>{</w:t>
+            </w:r>
+          </w:p>
+          <w:p>
+            <w:r>
+              <w:tab/>
+              <w:t>"nome": "</w:t>
+            </w:r>
+            <w:r>
+              <w:t>pessoa dois</w:t>
+            </w:r>
+            <w:r>
+              <w:t>",</w:t>
+            </w:r>
+          </w:p>
+          <w:p>
+            <w:r>
+              <w:tab/>
+            </w:r>
+            <w:r>
+              <w:t>"</w:t>
+            </w:r>
+            <w:proofErr w:type="spellStart"/>
+            <w:r>
               <w:t>email</w:t>
             </w:r>
             <w:proofErr w:type="spellEnd"/>
-          </w:p>
-        </w:tc>
-      </w:tr>
-      <w:tr>
-        <w:tc>
-          <w:tcPr>
-            <w:tcW w:w="2689" w:type="dxa"/>
-          </w:tcPr>
-          <w:p>
-            <w:r>
-              <w:t xml:space="preserve">Chamar o </w:t>
-            </w:r>
-            <w:proofErr w:type="spellStart"/>
-            <w:r>
-              <w:t>Endpoint</w:t>
-            </w:r>
-            <w:proofErr w:type="spellEnd"/>
-          </w:p>
-        </w:tc>
-        <w:tc>
-          <w:tcPr>
-            <w:tcW w:w="5805" w:type="dxa"/>
-          </w:tcPr>
-          <w:p>
-            <w:r>
-              <w:t xml:space="preserve">[1] </w:t>
-            </w:r>
-            <w:proofErr w:type="spellStart"/>
-            <w:r>
-              <w:t>Endpoint</w:t>
-            </w:r>
-            <w:proofErr w:type="spellEnd"/>
-            <w:r>
-              <w:t xml:space="preserve"> </w:t>
-            </w:r>
-            <w:proofErr w:type="spellStart"/>
-            <w:r>
-              <w:t>responsavel</w:t>
-            </w:r>
-            <w:proofErr w:type="spellEnd"/>
-            <w:r>
-              <w:t xml:space="preserve"> </w:t>
-            </w:r>
-            <w:proofErr w:type="gramStart"/>
-            <w:r>
-              <w:t>por Criar</w:t>
-            </w:r>
-            <w:proofErr w:type="gramEnd"/>
-            <w:r>
-              <w:t xml:space="preserve"> um novo </w:t>
-            </w:r>
-            <w:proofErr w:type="spellStart"/>
-            <w:r>
-              <w:t>Usuario</w:t>
-            </w:r>
-            <w:proofErr w:type="spellEnd"/>
-          </w:p>
-        </w:tc>
-      </w:tr>
-      <w:tr>
-        <w:tc>
-          <w:tcPr>
-            <w:tcW w:w="2689" w:type="dxa"/>
-          </w:tcPr>
-          <w:p>
-            <w:r>
-              <w:t>Descrição</w:t>
-            </w:r>
-          </w:p>
-        </w:tc>
-        <w:tc>
-          <w:tcPr>
-            <w:tcW w:w="5805" w:type="dxa"/>
-          </w:tcPr>
-          <w:p>
-            <w:r>
-              <w:t>Tentar inserir 2</w:t>
-            </w:r>
-            <w:r>
-              <w:t>x</w:t>
-            </w:r>
-            <w:r>
-              <w:t xml:space="preserve"> </w:t>
-            </w:r>
-            <w:r>
-              <w:t>o mesmo e-mail</w:t>
-            </w:r>
-          </w:p>
-        </w:tc>
-      </w:tr>
-      <w:tr>
-        <w:tc>
-          <w:tcPr>
-            <w:tcW w:w="2689" w:type="dxa"/>
-          </w:tcPr>
-          <w:p>
-            <w:proofErr w:type="spellStart"/>
-            <w:r>
-              <w:t>Payload</w:t>
-            </w:r>
-            <w:proofErr w:type="spellEnd"/>
-          </w:p>
-        </w:tc>
-        <w:tc>
-          <w:tcPr>
-            <w:tcW w:w="5805" w:type="dxa"/>
-          </w:tcPr>
-          <w:p>
-            <w:r>
-              <w:t>{</w:t>
-            </w:r>
-          </w:p>
-          <w:p>
-            <w:r>
-              <w:tab/>
-              <w:t>"nome": "</w:t>
-            </w:r>
-            <w:r>
-              <w:t>pessoa dois</w:t>
+            <w:r>
+              <w:t>": "</w:t>
+            </w:r>
+            <w:r>
+              <w:rPr>
+                <w:b/>
+                <w:bCs/>
+              </w:rPr>
+              <w:t>cenario2</w:t>
+            </w:r>
+            <w:r>
+              <w:rPr>
+                <w:b/>
+                <w:bCs/>
+              </w:rPr>
+              <w:t>@hotmail.com</w:t>
             </w:r>
             <w:r>
               <w:t>",</w:t>
@@ -7099,65 +6970,46 @@
           <w:p>
             <w:r>
               <w:tab/>
+              <w:t>"login": "</w:t>
+            </w:r>
+            <w:r>
+              <w:t>teste</w:t>
+            </w:r>
+            <w:r>
+              <w:t>002</w:t>
+            </w:r>
+            <w:r>
+              <w:t>",</w:t>
+            </w:r>
+          </w:p>
+          <w:p>
+            <w:r>
+              <w:tab/>
             </w:r>
             <w:r>
               <w:t>"</w:t>
             </w:r>
             <w:proofErr w:type="spellStart"/>
             <w:r>
-              <w:t>email</w:t>
-            </w:r>
-            <w:proofErr w:type="spellEnd"/>
-            <w:r>
-              <w:t>": "</w:t>
-            </w:r>
-            <w:r>
-              <w:rPr>
-                <w:b/>
-                <w:bCs/>
-              </w:rPr>
-              <w:t>cenario2</w:t>
-            </w:r>
-            <w:r>
-              <w:rPr>
-                <w:b/>
-                <w:bCs/>
-              </w:rPr>
-              <w:t>@hotmail.com</w:t>
-            </w:r>
-            <w:r>
-              <w:t>",</w:t>
-            </w:r>
-          </w:p>
-          <w:p>
-            <w:r>
-              <w:tab/>
-              <w:t>"login": "</w:t>
-            </w:r>
-            <w:r>
-              <w:t>teste</w:t>
-            </w:r>
-            <w:r>
-              <w:t>002</w:t>
-            </w:r>
-            <w:r>
-              <w:t>",</w:t>
-            </w:r>
-          </w:p>
-          <w:p>
-            <w:r>
-              <w:tab/>
-            </w:r>
-            <w:r>
+              <w:t>password</w:t>
+            </w:r>
+            <w:proofErr w:type="spellEnd"/>
+            <w:r>
+              <w:t>": "pasini123",</w:t>
+            </w:r>
+          </w:p>
+          <w:p>
+            <w:r>
+              <w:tab/>
               <w:t>"</w:t>
             </w:r>
             <w:proofErr w:type="spellStart"/>
             <w:r>
-              <w:t>password</w:t>
-            </w:r>
-            <w:proofErr w:type="spellEnd"/>
-            <w:r>
-              <w:t>": "pasini123",</w:t>
+              <w:t>tipoUsuario</w:t>
+            </w:r>
+            <w:proofErr w:type="spellEnd"/>
+            <w:r>
+              <w:t>": "CLIENTE",</w:t>
             </w:r>
           </w:p>
           <w:p>
@@ -7167,20 +7019,6 @@
             </w:r>
             <w:proofErr w:type="spellStart"/>
             <w:r>
-              <w:t>tipoUsuario</w:t>
-            </w:r>
-            <w:proofErr w:type="spellEnd"/>
-            <w:r>
-              <w:t>": "CLIENTE",</w:t>
-            </w:r>
-          </w:p>
-          <w:p>
-            <w:r>
-              <w:tab/>
-              <w:t>"</w:t>
-            </w:r>
-            <w:proofErr w:type="spellStart"/>
-            <w:r>
               <w:t>endereco</w:t>
             </w:r>
             <w:proofErr w:type="spellEnd"/>
@@ -7211,15 +7049,7 @@
             </w:r>
             <w:r>
               <w:tab/>
-              <w:t>"</w:t>
-            </w:r>
-            <w:proofErr w:type="gramStart"/>
-            <w:r>
-              <w:t>numero</w:t>
-            </w:r>
-            <w:proofErr w:type="gramEnd"/>
-            <w:r>
-              <w:t>": "993",</w:t>
+              <w:t>"numero": "993",</w:t>
             </w:r>
           </w:p>
           <w:p>
@@ -7434,31 +7264,63 @@
                 <w:b/>
                 <w:bCs/>
               </w:rPr>
-              <w:t xml:space="preserve"> com </w:t>
-            </w:r>
-            <w:proofErr w:type="gramStart"/>
-            <w:r>
-              <w:rPr>
-                <w:b/>
-                <w:bCs/>
-              </w:rPr>
-              <w:t>o mesmo</w:t>
-            </w:r>
-            <w:proofErr w:type="gramEnd"/>
-            <w:r>
-              <w:rPr>
-                <w:b/>
-                <w:bCs/>
-              </w:rPr>
+              <w:t xml:space="preserve"> com o mesmo </w:t>
+            </w:r>
+            <w:r>
+              <w:rPr>
+                <w:b/>
+                <w:bCs/>
+              </w:rPr>
+              <w:t>login</w:t>
+            </w:r>
+          </w:p>
+        </w:tc>
+      </w:tr>
+      <w:tr>
+        <w:tc>
+          <w:tcPr>
+            <w:tcW w:w="2689" w:type="dxa"/>
+          </w:tcPr>
+          <w:p>
+            <w:r>
+              <w:t xml:space="preserve">Chamar o </w:t>
+            </w:r>
+            <w:proofErr w:type="spellStart"/>
+            <w:r>
+              <w:t>Endpoint</w:t>
+            </w:r>
+            <w:proofErr w:type="spellEnd"/>
+          </w:p>
+        </w:tc>
+        <w:tc>
+          <w:tcPr>
+            <w:tcW w:w="5805" w:type="dxa"/>
+          </w:tcPr>
+          <w:p>
+            <w:r>
+              <w:t xml:space="preserve">[1] </w:t>
+            </w:r>
+            <w:proofErr w:type="spellStart"/>
+            <w:r>
+              <w:t>Endpoint</w:t>
+            </w:r>
+            <w:proofErr w:type="spellEnd"/>
+            <w:r>
               <w:t xml:space="preserve"> </w:t>
             </w:r>
-            <w:r>
-              <w:rPr>
-                <w:b/>
-                <w:bCs/>
-              </w:rPr>
-              <w:t>login</w:t>
-            </w:r>
+            <w:proofErr w:type="spellStart"/>
+            <w:r>
+              <w:t>responsavel</w:t>
+            </w:r>
+            <w:proofErr w:type="spellEnd"/>
+            <w:r>
+              <w:t xml:space="preserve"> por Criar um novo </w:t>
+            </w:r>
+            <w:proofErr w:type="spellStart"/>
+            <w:r>
+              <w:t>Usuario</w:t>
+            </w:r>
+            <w:proofErr w:type="spellEnd"/>
           </w:p>
         </w:tc>
       </w:tr>
@@ -7469,13 +7331,8 @@
           </w:tcPr>
           <w:p>
             <w:r>
-              <w:t xml:space="preserve">Chamar o </w:t>
-            </w:r>
-            <w:proofErr w:type="spellStart"/>
-            <w:r>
-              <w:t>Endpoint</w:t>
-            </w:r>
-            <w:proofErr w:type="spellEnd"/>
+              <w:t>Descrição</w:t>
+            </w:r>
           </w:p>
         </w:tc>
         <w:tc>
@@ -7484,97 +7341,46 @@
           </w:tcPr>
           <w:p>
             <w:r>
-              <w:t xml:space="preserve">[1] </w:t>
-            </w:r>
-            <w:proofErr w:type="spellStart"/>
-            <w:r>
-              <w:t>Endpoint</w:t>
-            </w:r>
-            <w:proofErr w:type="spellEnd"/>
+              <w:t>Tentar inserir 2x o mesmo login</w:t>
+            </w:r>
+          </w:p>
+        </w:tc>
+      </w:tr>
+      <w:tr>
+        <w:tc>
+          <w:tcPr>
+            <w:tcW w:w="2689" w:type="dxa"/>
+          </w:tcPr>
+          <w:p>
+            <w:proofErr w:type="spellStart"/>
+            <w:r>
+              <w:t>Payload</w:t>
+            </w:r>
+            <w:proofErr w:type="spellEnd"/>
+          </w:p>
+        </w:tc>
+        <w:tc>
+          <w:tcPr>
+            <w:tcW w:w="5805" w:type="dxa"/>
+          </w:tcPr>
+          <w:p>
+            <w:r>
+              <w:t>{</w:t>
+            </w:r>
+          </w:p>
+          <w:p>
+            <w:r>
+              <w:tab/>
+              <w:t>"nome": "</w:t>
+            </w:r>
+            <w:r>
+              <w:t>pessoa</w:t>
+            </w:r>
             <w:r>
               <w:t xml:space="preserve"> </w:t>
             </w:r>
             <w:proofErr w:type="spellStart"/>
             <w:r>
-              <w:t>responsavel</w:t>
-            </w:r>
-            <w:proofErr w:type="spellEnd"/>
-            <w:r>
-              <w:t xml:space="preserve"> </w:t>
-            </w:r>
-            <w:proofErr w:type="gramStart"/>
-            <w:r>
-              <w:t>por Criar</w:t>
-            </w:r>
-            <w:proofErr w:type="gramEnd"/>
-            <w:r>
-              <w:t xml:space="preserve"> um novo </w:t>
-            </w:r>
-            <w:proofErr w:type="spellStart"/>
-            <w:r>
-              <w:t>Usuario</w:t>
-            </w:r>
-            <w:proofErr w:type="spellEnd"/>
-          </w:p>
-        </w:tc>
-      </w:tr>
-      <w:tr>
-        <w:tc>
-          <w:tcPr>
-            <w:tcW w:w="2689" w:type="dxa"/>
-          </w:tcPr>
-          <w:p>
-            <w:r>
-              <w:t>Descrição</w:t>
-            </w:r>
-          </w:p>
-        </w:tc>
-        <w:tc>
-          <w:tcPr>
-            <w:tcW w:w="5805" w:type="dxa"/>
-          </w:tcPr>
-          <w:p>
-            <w:r>
-              <w:t>Tentar inserir 2x o mesmo login</w:t>
-            </w:r>
-          </w:p>
-        </w:tc>
-      </w:tr>
-      <w:tr>
-        <w:tc>
-          <w:tcPr>
-            <w:tcW w:w="2689" w:type="dxa"/>
-          </w:tcPr>
-          <w:p>
-            <w:proofErr w:type="spellStart"/>
-            <w:r>
-              <w:t>Payload</w:t>
-            </w:r>
-            <w:proofErr w:type="spellEnd"/>
-          </w:p>
-        </w:tc>
-        <w:tc>
-          <w:tcPr>
-            <w:tcW w:w="5805" w:type="dxa"/>
-          </w:tcPr>
-          <w:p>
-            <w:r>
-              <w:t>{</w:t>
-            </w:r>
-          </w:p>
-          <w:p>
-            <w:r>
-              <w:tab/>
-              <w:t>"nome": "</w:t>
-            </w:r>
-            <w:r>
-              <w:t>pessoa</w:t>
-            </w:r>
-            <w:r>
-              <w:t xml:space="preserve"> </w:t>
-            </w:r>
-            <w:proofErr w:type="spellStart"/>
-            <w:r>
               <w:t>tres</w:t>
             </w:r>
             <w:proofErr w:type="spellEnd"/>
@@ -7686,15 +7492,7 @@
             </w:r>
             <w:r>
               <w:tab/>
-              <w:t>"</w:t>
-            </w:r>
-            <w:proofErr w:type="gramStart"/>
-            <w:r>
-              <w:t>numero</w:t>
-            </w:r>
-            <w:proofErr w:type="gramEnd"/>
-            <w:r>
-              <w:t>": "993",</w:t>
+              <w:t>"numero": "993",</w:t>
             </w:r>
           </w:p>
           <w:p>
@@ -7960,15 +7758,7 @@
             </w:r>
             <w:proofErr w:type="spellEnd"/>
             <w:r>
-              <w:t xml:space="preserve"> </w:t>
-            </w:r>
-            <w:proofErr w:type="gramStart"/>
-            <w:r>
-              <w:t>por Criar</w:t>
-            </w:r>
-            <w:proofErr w:type="gramEnd"/>
-            <w:r>
-              <w:t xml:space="preserve"> um novo </w:t>
+              <w:t xml:space="preserve"> por Criar um novo </w:t>
             </w:r>
             <w:proofErr w:type="spellStart"/>
             <w:r>
@@ -8026,23 +7816,12 @@
             <w:tcW w:w="5805" w:type="dxa"/>
           </w:tcPr>
           <w:p>
-            <w:pPr>
-              <w:rPr>
-                <w:lang w:val="en-US"/>
-              </w:rPr>
-            </w:pPr>
-            <w:r>
-              <w:rPr>
-                <w:lang w:val="en-US"/>
-              </w:rPr>
+            <w:r>
               <w:t>{</w:t>
             </w:r>
           </w:p>
           <w:p>
             <w:r>
-              <w:rPr>
-                <w:lang w:val="en-US"/>
-              </w:rPr>
               <w:tab/>
             </w:r>
             <w:r>
@@ -8142,15 +7921,7 @@
             </w:r>
             <w:r>
               <w:tab/>
-              <w:t>"</w:t>
-            </w:r>
-            <w:proofErr w:type="gramStart"/>
-            <w:r>
-              <w:t>numero</w:t>
-            </w:r>
-            <w:proofErr w:type="gramEnd"/>
-            <w:r>
-              <w:t>": "993",</w:t>
+              <w:t>"numero": "993",</w:t>
             </w:r>
           </w:p>
           <w:p>
@@ -8424,15 +8195,7 @@
             </w:r>
             <w:proofErr w:type="spellEnd"/>
             <w:r>
-              <w:t xml:space="preserve"> </w:t>
-            </w:r>
-            <w:proofErr w:type="gramStart"/>
-            <w:r>
-              <w:t>por Criar</w:t>
-            </w:r>
-            <w:proofErr w:type="gramEnd"/>
-            <w:r>
-              <w:t xml:space="preserve"> um novo </w:t>
+              <w:t xml:space="preserve"> por Criar um novo </w:t>
             </w:r>
             <w:proofErr w:type="spellStart"/>
             <w:r>
@@ -8591,15 +8354,7 @@
             </w:r>
             <w:r>
               <w:tab/>
-              <w:t>"</w:t>
-            </w:r>
-            <w:proofErr w:type="gramStart"/>
-            <w:r>
-              <w:t>numero</w:t>
-            </w:r>
-            <w:proofErr w:type="gramEnd"/>
-            <w:r>
-              <w:t>": "993",</w:t>
+              <w:t>"numero": "993",</w:t>
             </w:r>
           </w:p>
           <w:p>
@@ -8894,15 +8649,7 @@
             </w:r>
             <w:proofErr w:type="spellEnd"/>
             <w:r>
-              <w:t xml:space="preserve"> </w:t>
-            </w:r>
-            <w:proofErr w:type="gramStart"/>
-            <w:r>
-              <w:t>por Criar</w:t>
-            </w:r>
-            <w:proofErr w:type="gramEnd"/>
-            <w:r>
-              <w:t xml:space="preserve"> um novo </w:t>
+              <w:t xml:space="preserve"> por Criar um novo </w:t>
             </w:r>
             <w:proofErr w:type="spellStart"/>
             <w:r>
@@ -9069,15 +8816,7 @@
             </w:r>
             <w:r>
               <w:tab/>
-              <w:t>"</w:t>
-            </w:r>
-            <w:proofErr w:type="gramStart"/>
-            <w:r>
-              <w:t>numero</w:t>
-            </w:r>
-            <w:proofErr w:type="gramEnd"/>
-            <w:r>
-              <w:t>": "993",</w:t>
+              <w:t>"numero": "993",</w:t>
             </w:r>
           </w:p>
           <w:p>
@@ -9363,15 +9102,7 @@
             </w:r>
             <w:proofErr w:type="spellEnd"/>
             <w:r>
-              <w:t xml:space="preserve"> </w:t>
-            </w:r>
-            <w:proofErr w:type="gramStart"/>
-            <w:r>
-              <w:t>por Criar</w:t>
-            </w:r>
-            <w:proofErr w:type="gramEnd"/>
-            <w:r>
-              <w:t xml:space="preserve"> um novo </w:t>
+              <w:t xml:space="preserve"> por Criar um novo </w:t>
             </w:r>
             <w:proofErr w:type="spellStart"/>
             <w:r>
@@ -9533,15 +9264,7 @@
             </w:r>
             <w:r>
               <w:tab/>
-              <w:t>"</w:t>
-            </w:r>
-            <w:proofErr w:type="gramStart"/>
-            <w:r>
-              <w:t>numero</w:t>
-            </w:r>
-            <w:proofErr w:type="gramEnd"/>
-            <w:r>
-              <w:t>": "993",</w:t>
+              <w:t>"numero": "993",</w:t>
             </w:r>
           </w:p>
           <w:p>
@@ -9834,15 +9557,7 @@
             </w:r>
             <w:proofErr w:type="spellEnd"/>
             <w:r>
-              <w:t xml:space="preserve"> </w:t>
-            </w:r>
-            <w:proofErr w:type="gramStart"/>
-            <w:r>
-              <w:t>por Criar</w:t>
-            </w:r>
-            <w:proofErr w:type="gramEnd"/>
-            <w:r>
-              <w:t xml:space="preserve"> um novo </w:t>
+              <w:t xml:space="preserve"> por Criar um novo </w:t>
             </w:r>
             <w:proofErr w:type="spellStart"/>
             <w:r>
@@ -9942,88 +9657,52 @@
             </w:r>
           </w:p>
           <w:p>
-            <w:pPr>
-              <w:rPr>
-                <w:lang w:val="en-US"/>
-              </w:rPr>
-            </w:pPr>
-            <w:r>
-              <w:tab/>
-            </w:r>
-            <w:r>
-              <w:rPr>
-                <w:lang w:val="en-US"/>
-              </w:rPr>
+            <w:r>
+              <w:tab/>
+            </w:r>
+            <w:r>
               <w:t>"login": "</w:t>
             </w:r>
             <w:r>
-              <w:rPr>
-                <w:lang w:val="en-US"/>
-              </w:rPr>
               <w:t>cenario8</w:t>
             </w:r>
             <w:r>
-              <w:rPr>
-                <w:lang w:val="en-US"/>
-              </w:rPr>
               <w:t>",</w:t>
             </w:r>
           </w:p>
           <w:p>
-            <w:pPr>
-              <w:rPr>
-                <w:lang w:val="en-US"/>
-              </w:rPr>
-            </w:pPr>
-            <w:r>
-              <w:rPr>
-                <w:lang w:val="en-US"/>
-              </w:rPr>
-              <w:tab/>
-              <w:t>"password": "pasini123",</w:t>
-            </w:r>
-          </w:p>
-          <w:p>
-            <w:pPr>
-              <w:rPr>
-                <w:lang w:val="en-US"/>
-              </w:rPr>
-            </w:pPr>
-            <w:r>
-              <w:rPr>
-                <w:lang w:val="en-US"/>
-              </w:rPr>
+            <w:r>
               <w:tab/>
               <w:t>"</w:t>
             </w:r>
             <w:proofErr w:type="spellStart"/>
             <w:r>
-              <w:rPr>
-                <w:lang w:val="en-US"/>
-              </w:rPr>
+              <w:t>password</w:t>
+            </w:r>
+            <w:proofErr w:type="spellEnd"/>
+            <w:r>
+              <w:t>": "pasini123",</w:t>
+            </w:r>
+          </w:p>
+          <w:p>
+            <w:r>
+              <w:tab/>
+              <w:t>"</w:t>
+            </w:r>
+            <w:proofErr w:type="spellStart"/>
+            <w:r>
               <w:t>endereco</w:t>
             </w:r>
             <w:proofErr w:type="spellEnd"/>
-            <w:proofErr w:type="gramStart"/>
-            <w:r>
-              <w:rPr>
-                <w:lang w:val="en-US"/>
-              </w:rPr>
+            <w:r>
               <w:t>": {</w:t>
             </w:r>
-            <w:proofErr w:type="gramEnd"/>
-          </w:p>
-          <w:p>
-            <w:r>
-              <w:rPr>
-                <w:lang w:val="en-US"/>
-              </w:rPr>
-              <w:tab/>
-            </w:r>
-            <w:r>
-              <w:rPr>
-                <w:lang w:val="en-US"/>
-              </w:rPr>
+          </w:p>
+          <w:p>
+            <w:r>
+              <w:tab/>
+            </w:r>
+            <w:r>
               <w:tab/>
             </w:r>
             <w:r>
@@ -10044,15 +9723,7 @@
             </w:r>
             <w:r>
               <w:tab/>
-              <w:t>"</w:t>
-            </w:r>
-            <w:proofErr w:type="gramStart"/>
-            <w:r>
-              <w:t>numero</w:t>
-            </w:r>
-            <w:proofErr w:type="gramEnd"/>
-            <w:r>
-              <w:t>": "993",</w:t>
+              <w:t>"numero": "993",</w:t>
             </w:r>
           </w:p>
           <w:p>
@@ -10342,15 +10013,7 @@
             </w:r>
             <w:proofErr w:type="spellEnd"/>
             <w:r>
-              <w:t xml:space="preserve"> </w:t>
-            </w:r>
-            <w:proofErr w:type="gramStart"/>
-            <w:r>
-              <w:t>por Criar</w:t>
-            </w:r>
-            <w:proofErr w:type="gramEnd"/>
-            <w:r>
-              <w:t xml:space="preserve"> um novo </w:t>
+              <w:t xml:space="preserve"> por Criar um novo </w:t>
             </w:r>
             <w:proofErr w:type="spellStart"/>
             <w:r>
@@ -10716,15 +10379,7 @@
             </w:r>
             <w:proofErr w:type="spellEnd"/>
             <w:r>
-              <w:t xml:space="preserve"> </w:t>
-            </w:r>
-            <w:proofErr w:type="gramStart"/>
-            <w:r>
-              <w:t>por Criar</w:t>
-            </w:r>
-            <w:proofErr w:type="gramEnd"/>
-            <w:r>
-              <w:t xml:space="preserve"> um novo </w:t>
+              <w:t xml:space="preserve"> por Criar um novo </w:t>
             </w:r>
             <w:proofErr w:type="spellStart"/>
             <w:r>
@@ -10881,116 +10536,108 @@
             </w:r>
             <w:r>
               <w:tab/>
+              <w:t>"numero": "993",</w:t>
+            </w:r>
+          </w:p>
+          <w:p>
+            <w:r>
+              <w:tab/>
+            </w:r>
+            <w:r>
+              <w:tab/>
+              <w:t>"complemento": "casa 2",</w:t>
+            </w:r>
+          </w:p>
+          <w:p>
+            <w:r>
+              <w:tab/>
+            </w:r>
+            <w:r>
+              <w:tab/>
+              <w:t>"cep": "06364550",</w:t>
+            </w:r>
+          </w:p>
+          <w:p>
+            <w:r>
+              <w:tab/>
+            </w:r>
+            <w:r>
+              <w:tab/>
+              <w:t>"cidade": "Carapicuiba",</w:t>
+            </w:r>
+          </w:p>
+          <w:p>
+            <w:r>
+              <w:tab/>
+            </w:r>
+            <w:r>
+              <w:tab/>
               <w:t>"</w:t>
             </w:r>
-            <w:proofErr w:type="gramStart"/>
-            <w:r>
-              <w:t>numero</w:t>
-            </w:r>
-            <w:proofErr w:type="gramEnd"/>
-            <w:r>
-              <w:t>": "993",</w:t>
-            </w:r>
-          </w:p>
-          <w:p>
-            <w:r>
-              <w:tab/>
-            </w:r>
-            <w:r>
-              <w:tab/>
-              <w:t>"complemento": "casa 2",</w:t>
-            </w:r>
-          </w:p>
-          <w:p>
-            <w:r>
-              <w:tab/>
-            </w:r>
-            <w:r>
-              <w:tab/>
-              <w:t>"cep": "06364550",</w:t>
-            </w:r>
-          </w:p>
-          <w:p>
-            <w:r>
-              <w:tab/>
-            </w:r>
-            <w:r>
-              <w:tab/>
-              <w:t>"cidade": "Carapicuiba",</w:t>
-            </w:r>
-          </w:p>
-          <w:p>
-            <w:r>
-              <w:tab/>
-            </w:r>
+            <w:proofErr w:type="spellStart"/>
+            <w:r>
+              <w:t>bairro":"Jardim</w:t>
+            </w:r>
+            <w:proofErr w:type="spellEnd"/>
+            <w:r>
+              <w:t xml:space="preserve"> Ana Estela",</w:t>
+            </w:r>
+          </w:p>
+          <w:p>
+            <w:r>
+              <w:tab/>
+            </w:r>
+            <w:r>
+              <w:tab/>
+              <w:t>"estado": "São Paulo"</w:t>
+            </w:r>
+          </w:p>
+          <w:p>
+            <w:r>
+              <w:tab/>
+              <w:t>}</w:t>
+            </w:r>
+          </w:p>
+          <w:p>
+            <w:r>
+              <w:t>}</w:t>
+            </w:r>
+          </w:p>
+        </w:tc>
+      </w:tr>
+      <w:tr>
+        <w:tc>
+          <w:tcPr>
+            <w:tcW w:w="2689" w:type="dxa"/>
+          </w:tcPr>
+          <w:p>
+            <w:r>
+              <w:t>Retorno esperado</w:t>
+            </w:r>
+          </w:p>
+        </w:tc>
+        <w:tc>
+          <w:tcPr>
+            <w:tcW w:w="5805" w:type="dxa"/>
+          </w:tcPr>
+          <w:p>
+            <w:r>
+              <w:t>{</w:t>
+            </w:r>
+          </w:p>
+          <w:p>
+            <w:r>
+              <w:tab/>
+              <w:t>"status": 400,</w:t>
+            </w:r>
+          </w:p>
+          <w:p>
             <w:r>
               <w:tab/>
               <w:t>"</w:t>
             </w:r>
             <w:proofErr w:type="spellStart"/>
             <w:r>
-              <w:t>bairro":"Jardim</w:t>
-            </w:r>
-            <w:proofErr w:type="spellEnd"/>
-            <w:r>
-              <w:t xml:space="preserve"> Ana Estela",</w:t>
-            </w:r>
-          </w:p>
-          <w:p>
-            <w:r>
-              <w:tab/>
-            </w:r>
-            <w:r>
-              <w:tab/>
-              <w:t>"estado": "São Paulo"</w:t>
-            </w:r>
-          </w:p>
-          <w:p>
-            <w:r>
-              <w:tab/>
-              <w:t>}</w:t>
-            </w:r>
-          </w:p>
-          <w:p>
-            <w:r>
-              <w:t>}</w:t>
-            </w:r>
-          </w:p>
-        </w:tc>
-      </w:tr>
-      <w:tr>
-        <w:tc>
-          <w:tcPr>
-            <w:tcW w:w="2689" w:type="dxa"/>
-          </w:tcPr>
-          <w:p>
-            <w:r>
-              <w:t>Retorno esperado</w:t>
-            </w:r>
-          </w:p>
-        </w:tc>
-        <w:tc>
-          <w:tcPr>
-            <w:tcW w:w="5805" w:type="dxa"/>
-          </w:tcPr>
-          <w:p>
-            <w:r>
-              <w:t>{</w:t>
-            </w:r>
-          </w:p>
-          <w:p>
-            <w:r>
-              <w:tab/>
-              <w:t>"status": 400,</w:t>
-            </w:r>
-          </w:p>
-          <w:p>
-            <w:r>
-              <w:tab/>
-              <w:t>"</w:t>
-            </w:r>
-            <w:proofErr w:type="spellStart"/>
-            <w:r>
               <w:t>message</w:t>
             </w:r>
             <w:proofErr w:type="spellEnd"/>
@@ -10998,22 +10645,18 @@
               <w:t>": "</w:t>
             </w:r>
             <w:proofErr w:type="spellStart"/>
-            <w:proofErr w:type="gramStart"/>
             <w:r>
               <w:t>endereco.logradouro</w:t>
             </w:r>
             <w:proofErr w:type="spellEnd"/>
-            <w:proofErr w:type="gramEnd"/>
             <w:r>
               <w:t xml:space="preserve">: é obrigatório; </w:t>
             </w:r>
             <w:proofErr w:type="spellStart"/>
-            <w:proofErr w:type="gramStart"/>
             <w:r>
               <w:t>endereco.logradouro</w:t>
             </w:r>
             <w:proofErr w:type="spellEnd"/>
-            <w:proofErr w:type="gramEnd"/>
             <w:r>
               <w:t>: não pode ser vazio;"</w:t>
             </w:r>
@@ -11133,7 +10776,6 @@
               </w:rPr>
               <w:t xml:space="preserve">sem </w:t>
             </w:r>
-            <w:proofErr w:type="gramStart"/>
             <w:r>
               <w:rPr>
                 <w:b/>
@@ -11141,7 +10783,6 @@
               </w:rPr>
               <w:t>numero</w:t>
             </w:r>
-            <w:proofErr w:type="gramEnd"/>
           </w:p>
         </w:tc>
       </w:tr>
@@ -11183,15 +10824,7 @@
             </w:r>
             <w:proofErr w:type="spellEnd"/>
             <w:r>
-              <w:t xml:space="preserve"> </w:t>
-            </w:r>
-            <w:proofErr w:type="gramStart"/>
-            <w:r>
-              <w:t>por Criar</w:t>
-            </w:r>
-            <w:proofErr w:type="gramEnd"/>
-            <w:r>
-              <w:t xml:space="preserve"> um novo </w:t>
+              <w:t xml:space="preserve"> por Criar um novo </w:t>
             </w:r>
             <w:proofErr w:type="spellStart"/>
             <w:r>
@@ -11228,11 +10861,9 @@
             <w:r>
               <w:t xml:space="preserve"> sem </w:t>
             </w:r>
-            <w:proofErr w:type="gramStart"/>
             <w:r>
               <w:t>numero</w:t>
             </w:r>
-            <w:proofErr w:type="gramEnd"/>
           </w:p>
         </w:tc>
       </w:tr>
@@ -11467,22 +11098,18 @@
               <w:t>": "</w:t>
             </w:r>
             <w:proofErr w:type="spellStart"/>
-            <w:proofErr w:type="gramStart"/>
             <w:r>
               <w:t>endereco.numero</w:t>
             </w:r>
             <w:proofErr w:type="spellEnd"/>
-            <w:proofErr w:type="gramEnd"/>
             <w:r>
               <w:t xml:space="preserve">: não pode ser vazio; </w:t>
             </w:r>
             <w:proofErr w:type="spellStart"/>
-            <w:proofErr w:type="gramStart"/>
             <w:r>
               <w:t>endereco.numero</w:t>
             </w:r>
             <w:proofErr w:type="spellEnd"/>
-            <w:proofErr w:type="gramEnd"/>
             <w:r>
               <w:t>: é obrigatório;"</w:t>
             </w:r>
@@ -11651,15 +11278,7 @@
             </w:r>
             <w:proofErr w:type="spellEnd"/>
             <w:r>
-              <w:t xml:space="preserve"> </w:t>
-            </w:r>
-            <w:proofErr w:type="gramStart"/>
-            <w:r>
-              <w:t>por Criar</w:t>
-            </w:r>
-            <w:proofErr w:type="gramEnd"/>
-            <w:r>
-              <w:t xml:space="preserve"> um novo </w:t>
+              <w:t xml:space="preserve"> por Criar um novo </w:t>
             </w:r>
             <w:proofErr w:type="spellStart"/>
             <w:r>
@@ -11833,15 +11452,7 @@
             </w:r>
             <w:r>
               <w:tab/>
-              <w:t>"</w:t>
-            </w:r>
-            <w:proofErr w:type="gramStart"/>
-            <w:r>
-              <w:t>numero</w:t>
-            </w:r>
-            <w:proofErr w:type="gramEnd"/>
-            <w:r>
-              <w:t>": "993",</w:t>
+              <w:t>"numero": "993",</w:t>
             </w:r>
           </w:p>
           <w:p>
@@ -12120,15 +11731,7 @@
             </w:r>
             <w:proofErr w:type="spellEnd"/>
             <w:r>
-              <w:t xml:space="preserve"> </w:t>
-            </w:r>
-            <w:proofErr w:type="gramStart"/>
-            <w:r>
-              <w:t>por Criar</w:t>
-            </w:r>
-            <w:proofErr w:type="gramEnd"/>
-            <w:r>
-              <w:t xml:space="preserve"> um novo </w:t>
+              <w:t xml:space="preserve"> por Criar um novo </w:t>
             </w:r>
             <w:proofErr w:type="spellStart"/>
             <w:r>
@@ -12302,107 +11905,99 @@
             </w:r>
             <w:r>
               <w:tab/>
+              <w:t>"numero": "993",</w:t>
+            </w:r>
+          </w:p>
+          <w:p>
+            <w:r>
+              <w:tab/>
+            </w:r>
+            <w:r>
+              <w:tab/>
+              <w:t>"complemento": "casa 2",</w:t>
+            </w:r>
+          </w:p>
+          <w:p>
+            <w:r>
+              <w:tab/>
+            </w:r>
+            <w:r>
+              <w:tab/>
+              <w:t>"cep": "06364550",</w:t>
+            </w:r>
+          </w:p>
+          <w:p>
+            <w:r>
+              <w:tab/>
+            </w:r>
+            <w:r>
+              <w:tab/>
               <w:t>"</w:t>
             </w:r>
-            <w:proofErr w:type="gramStart"/>
-            <w:r>
-              <w:t>numero</w:t>
-            </w:r>
-            <w:proofErr w:type="gramEnd"/>
-            <w:r>
-              <w:t>": "993",</w:t>
-            </w:r>
-          </w:p>
-          <w:p>
-            <w:r>
-              <w:tab/>
-            </w:r>
-            <w:r>
-              <w:tab/>
-              <w:t>"complemento": "casa 2",</w:t>
-            </w:r>
-          </w:p>
-          <w:p>
-            <w:r>
-              <w:tab/>
-            </w:r>
-            <w:r>
-              <w:tab/>
-              <w:t>"cep": "06364550",</w:t>
-            </w:r>
-          </w:p>
-          <w:p>
-            <w:r>
-              <w:tab/>
-            </w:r>
+            <w:proofErr w:type="spellStart"/>
+            <w:r>
+              <w:t>bairro":"Jardim</w:t>
+            </w:r>
+            <w:proofErr w:type="spellEnd"/>
+            <w:r>
+              <w:t xml:space="preserve"> Ana Estela",</w:t>
+            </w:r>
+          </w:p>
+          <w:p>
+            <w:r>
+              <w:tab/>
+            </w:r>
+            <w:r>
+              <w:tab/>
+              <w:t>"estado": "São Paulo"</w:t>
+            </w:r>
+          </w:p>
+          <w:p>
+            <w:r>
+              <w:tab/>
+              <w:t>}</w:t>
+            </w:r>
+          </w:p>
+          <w:p>
+            <w:r>
+              <w:t>}</w:t>
+            </w:r>
+          </w:p>
+        </w:tc>
+      </w:tr>
+      <w:tr>
+        <w:tc>
+          <w:tcPr>
+            <w:tcW w:w="2689" w:type="dxa"/>
+          </w:tcPr>
+          <w:p>
+            <w:r>
+              <w:t>Retorno esperado</w:t>
+            </w:r>
+          </w:p>
+        </w:tc>
+        <w:tc>
+          <w:tcPr>
+            <w:tcW w:w="5805" w:type="dxa"/>
+          </w:tcPr>
+          <w:p>
+            <w:r>
+              <w:t>{</w:t>
+            </w:r>
+          </w:p>
+          <w:p>
+            <w:r>
+              <w:tab/>
+              <w:t>"status": 400,</w:t>
+            </w:r>
+          </w:p>
+          <w:p>
             <w:r>
               <w:tab/>
               <w:t>"</w:t>
             </w:r>
             <w:proofErr w:type="spellStart"/>
             <w:r>
-              <w:t>bairro":"Jardim</w:t>
-            </w:r>
-            <w:proofErr w:type="spellEnd"/>
-            <w:r>
-              <w:t xml:space="preserve"> Ana Estela",</w:t>
-            </w:r>
-          </w:p>
-          <w:p>
-            <w:r>
-              <w:tab/>
-            </w:r>
-            <w:r>
-              <w:tab/>
-              <w:t>"estado": "São Paulo"</w:t>
-            </w:r>
-          </w:p>
-          <w:p>
-            <w:r>
-              <w:tab/>
-              <w:t>}</w:t>
-            </w:r>
-          </w:p>
-          <w:p>
-            <w:r>
-              <w:t>}</w:t>
-            </w:r>
-          </w:p>
-        </w:tc>
-      </w:tr>
-      <w:tr>
-        <w:tc>
-          <w:tcPr>
-            <w:tcW w:w="2689" w:type="dxa"/>
-          </w:tcPr>
-          <w:p>
-            <w:r>
-              <w:t>Retorno esperado</w:t>
-            </w:r>
-          </w:p>
-        </w:tc>
-        <w:tc>
-          <w:tcPr>
-            <w:tcW w:w="5805" w:type="dxa"/>
-          </w:tcPr>
-          <w:p>
-            <w:r>
-              <w:t>{</w:t>
-            </w:r>
-          </w:p>
-          <w:p>
-            <w:r>
-              <w:tab/>
-              <w:t>"status": 400,</w:t>
-            </w:r>
-          </w:p>
-          <w:p>
-            <w:r>
-              <w:tab/>
-              <w:t>"</w:t>
-            </w:r>
-            <w:proofErr w:type="spellStart"/>
-            <w:r>
               <w:t>message</w:t>
             </w:r>
             <w:proofErr w:type="spellEnd"/>
@@ -12410,22 +12005,18 @@
               <w:t>": "</w:t>
             </w:r>
             <w:proofErr w:type="spellStart"/>
-            <w:proofErr w:type="gramStart"/>
             <w:r>
               <w:t>endereco.cidade</w:t>
             </w:r>
             <w:proofErr w:type="spellEnd"/>
-            <w:proofErr w:type="gramEnd"/>
             <w:r>
               <w:t xml:space="preserve">: não pode ser vazio; </w:t>
             </w:r>
             <w:proofErr w:type="spellStart"/>
-            <w:proofErr w:type="gramStart"/>
             <w:r>
               <w:t>endereco.cidade</w:t>
             </w:r>
             <w:proofErr w:type="spellEnd"/>
-            <w:proofErr w:type="gramEnd"/>
             <w:r>
               <w:t>: é obrigatório;"</w:t>
             </w:r>
@@ -12594,15 +12185,7 @@
             </w:r>
             <w:proofErr w:type="spellEnd"/>
             <w:r>
-              <w:t xml:space="preserve"> </w:t>
-            </w:r>
-            <w:proofErr w:type="gramStart"/>
-            <w:r>
-              <w:t>por Criar</w:t>
-            </w:r>
-            <w:proofErr w:type="gramEnd"/>
-            <w:r>
-              <w:t xml:space="preserve"> um novo </w:t>
+              <w:t xml:space="preserve"> por Criar um novo </w:t>
             </w:r>
             <w:proofErr w:type="spellStart"/>
             <w:r>
@@ -12776,107 +12359,99 @@
             </w:r>
             <w:r>
               <w:tab/>
+              <w:t>"numero": "993",</w:t>
+            </w:r>
+          </w:p>
+          <w:p>
+            <w:r>
+              <w:tab/>
+            </w:r>
+            <w:r>
+              <w:tab/>
+              <w:t>"complemento": "casa 2",</w:t>
+            </w:r>
+          </w:p>
+          <w:p>
+            <w:r>
+              <w:tab/>
+            </w:r>
+            <w:r>
+              <w:tab/>
+              <w:t>"cep": "06364550",</w:t>
+            </w:r>
+          </w:p>
+          <w:p>
+            <w:r>
+              <w:tab/>
+            </w:r>
+            <w:r>
+              <w:tab/>
+              <w:t>"cidade": "Carapicuiba",</w:t>
+            </w:r>
+          </w:p>
+          <w:p>
+            <w:r>
+              <w:tab/>
+            </w:r>
+            <w:r>
+              <w:tab/>
               <w:t>"</w:t>
             </w:r>
-            <w:proofErr w:type="gramStart"/>
-            <w:r>
-              <w:t>numero</w:t>
-            </w:r>
-            <w:proofErr w:type="gramEnd"/>
-            <w:r>
-              <w:t>": "993",</w:t>
-            </w:r>
-          </w:p>
-          <w:p>
-            <w:r>
-              <w:tab/>
-            </w:r>
-            <w:r>
-              <w:tab/>
-              <w:t>"complemento": "casa 2",</w:t>
-            </w:r>
-          </w:p>
-          <w:p>
-            <w:r>
-              <w:tab/>
-            </w:r>
-            <w:r>
-              <w:tab/>
-              <w:t>"cep": "06364550",</w:t>
-            </w:r>
-          </w:p>
-          <w:p>
-            <w:r>
-              <w:tab/>
-            </w:r>
-            <w:r>
-              <w:tab/>
-              <w:t>"cidade": "Carapicuiba",</w:t>
-            </w:r>
-          </w:p>
-          <w:p>
-            <w:r>
-              <w:tab/>
-            </w:r>
+            <w:proofErr w:type="spellStart"/>
+            <w:r>
+              <w:t>bairro":"Jardim</w:t>
+            </w:r>
+            <w:proofErr w:type="spellEnd"/>
+            <w:r>
+              <w:t xml:space="preserve"> Ana Estela"</w:t>
+            </w:r>
+          </w:p>
+          <w:p>
+            <w:r>
+              <w:tab/>
+              <w:t>}</w:t>
+            </w:r>
+          </w:p>
+          <w:p>
+            <w:r>
+              <w:t>}</w:t>
+            </w:r>
+          </w:p>
+        </w:tc>
+      </w:tr>
+      <w:tr>
+        <w:tc>
+          <w:tcPr>
+            <w:tcW w:w="2689" w:type="dxa"/>
+          </w:tcPr>
+          <w:p>
+            <w:r>
+              <w:t>Retorno esperado</w:t>
+            </w:r>
+          </w:p>
+        </w:tc>
+        <w:tc>
+          <w:tcPr>
+            <w:tcW w:w="5805" w:type="dxa"/>
+          </w:tcPr>
+          <w:p>
+            <w:r>
+              <w:t>{</w:t>
+            </w:r>
+          </w:p>
+          <w:p>
+            <w:r>
+              <w:tab/>
+              <w:t>"status": 400,</w:t>
+            </w:r>
+          </w:p>
+          <w:p>
             <w:r>
               <w:tab/>
               <w:t>"</w:t>
             </w:r>
             <w:proofErr w:type="spellStart"/>
             <w:r>
-              <w:t>bairro":"Jardim</w:t>
-            </w:r>
-            <w:proofErr w:type="spellEnd"/>
-            <w:r>
-              <w:t xml:space="preserve"> Ana Estela"</w:t>
-            </w:r>
-          </w:p>
-          <w:p>
-            <w:r>
-              <w:tab/>
-              <w:t>}</w:t>
-            </w:r>
-          </w:p>
-          <w:p>
-            <w:r>
-              <w:t>}</w:t>
-            </w:r>
-          </w:p>
-        </w:tc>
-      </w:tr>
-      <w:tr>
-        <w:tc>
-          <w:tcPr>
-            <w:tcW w:w="2689" w:type="dxa"/>
-          </w:tcPr>
-          <w:p>
-            <w:r>
-              <w:t>Retorno esperado</w:t>
-            </w:r>
-          </w:p>
-        </w:tc>
-        <w:tc>
-          <w:tcPr>
-            <w:tcW w:w="5805" w:type="dxa"/>
-          </w:tcPr>
-          <w:p>
-            <w:r>
-              <w:t>{</w:t>
-            </w:r>
-          </w:p>
-          <w:p>
-            <w:r>
-              <w:tab/>
-              <w:t>"status": 400,</w:t>
-            </w:r>
-          </w:p>
-          <w:p>
-            <w:r>
-              <w:tab/>
-              <w:t>"</w:t>
-            </w:r>
-            <w:proofErr w:type="spellStart"/>
-            <w:r>
               <w:t>message</w:t>
             </w:r>
             <w:proofErr w:type="spellEnd"/>
@@ -12884,22 +12459,18 @@
               <w:t>": "</w:t>
             </w:r>
             <w:proofErr w:type="spellStart"/>
-            <w:proofErr w:type="gramStart"/>
             <w:r>
               <w:t>endereco.estado</w:t>
             </w:r>
             <w:proofErr w:type="spellEnd"/>
-            <w:proofErr w:type="gramEnd"/>
             <w:r>
               <w:t xml:space="preserve">: é obrigatório; </w:t>
             </w:r>
             <w:proofErr w:type="spellStart"/>
-            <w:proofErr w:type="gramStart"/>
             <w:r>
               <w:t>endereco.estado</w:t>
             </w:r>
             <w:proofErr w:type="spellEnd"/>
-            <w:proofErr w:type="gramEnd"/>
             <w:r>
               <w:t>: não pode ser vazio;"</w:t>
             </w:r>
@@ -14223,15 +13794,7 @@
               <w:t xml:space="preserve">Tentar </w:t>
             </w:r>
             <w:r>
-              <w:t xml:space="preserve">atualizar a senha, </w:t>
-            </w:r>
-            <w:proofErr w:type="gramStart"/>
-            <w:r>
-              <w:t>porem</w:t>
-            </w:r>
-            <w:proofErr w:type="gramEnd"/>
-            <w:r>
-              <w:t xml:space="preserve"> passando a senha antiga invalida</w:t>
+              <w:t>atualizar a senha, porem passando a senha antiga invalida</w:t>
             </w:r>
           </w:p>
         </w:tc>
@@ -14638,15 +14201,7 @@
             </w:r>
             <w:proofErr w:type="spellEnd"/>
             <w:r>
-              <w:t xml:space="preserve">": </w:t>
-            </w:r>
-            <w:proofErr w:type="gramStart"/>
-            <w:r>
-              <w:t>"As senha nova</w:t>
-            </w:r>
-            <w:proofErr w:type="gramEnd"/>
-            <w:r>
-              <w:t xml:space="preserve"> não coincide com a confirmação de senha"</w:t>
+              <w:t>": "As senha nova não coincide com a confirmação de senha"</w:t>
             </w:r>
           </w:p>
           <w:p>
@@ -15303,36 +14858,28 @@
           </w:p>
           <w:p>
             <w:r>
+              <w:t>        "numero": "22",</w:t>
+            </w:r>
+          </w:p>
+          <w:p>
+            <w:r>
+              <w:t>        "complemento": "casa 22",</w:t>
+            </w:r>
+          </w:p>
+          <w:p>
+            <w:r>
+              <w:t>        "cep": "06364550",</w:t>
+            </w:r>
+          </w:p>
+          <w:p>
+            <w:r>
+              <w:t>        "cidade": "Carapicuiba",</w:t>
+            </w:r>
+          </w:p>
+          <w:p>
+            <w:r>
               <w:t>        "</w:t>
             </w:r>
-            <w:proofErr w:type="gramStart"/>
-            <w:r>
-              <w:t>numero</w:t>
-            </w:r>
-            <w:proofErr w:type="gramEnd"/>
-            <w:r>
-              <w:t>": "22",</w:t>
-            </w:r>
-          </w:p>
-          <w:p>
-            <w:r>
-              <w:t>        "complemento": "casa 22",</w:t>
-            </w:r>
-          </w:p>
-          <w:p>
-            <w:r>
-              <w:t>        "cep": "06364550",</w:t>
-            </w:r>
-          </w:p>
-          <w:p>
-            <w:r>
-              <w:t>        "cidade": "Carapicuiba",</w:t>
-            </w:r>
-          </w:p>
-          <w:p>
-            <w:r>
-              <w:t>        "</w:t>
-            </w:r>
             <w:proofErr w:type="spellStart"/>
             <w:r>
               <w:t>bairro":"Jardim</w:t>
@@ -15422,15 +14969,7 @@
           </w:p>
           <w:p>
             <w:r>
-              <w:t>        "</w:t>
-            </w:r>
-            <w:proofErr w:type="gramStart"/>
-            <w:r>
-              <w:t>numero</w:t>
-            </w:r>
-            <w:proofErr w:type="gramEnd"/>
-            <w:r>
-              <w:t>": "22",</w:t>
+              <w:t>        "numero": "22",</w:t>
             </w:r>
           </w:p>
           <w:p>
@@ -15834,52 +15373,44 @@
             </w:r>
             <w:r>
               <w:tab/>
+              <w:t>"numero": "993",</w:t>
+            </w:r>
+          </w:p>
+          <w:p>
+            <w:r>
+              <w:tab/>
+            </w:r>
+            <w:r>
+              <w:tab/>
+              <w:t>"complemento": "casa 2",</w:t>
+            </w:r>
+          </w:p>
+          <w:p>
+            <w:r>
+              <w:tab/>
+            </w:r>
+            <w:r>
+              <w:tab/>
+              <w:t>"cep": "06364550",</w:t>
+            </w:r>
+          </w:p>
+          <w:p>
+            <w:r>
+              <w:tab/>
+            </w:r>
+            <w:r>
+              <w:tab/>
+              <w:t>"cidade": "Carapicuiba",</w:t>
+            </w:r>
+          </w:p>
+          <w:p>
+            <w:r>
+              <w:tab/>
+            </w:r>
+            <w:r>
+              <w:tab/>
               <w:t>"</w:t>
             </w:r>
-            <w:proofErr w:type="gramStart"/>
-            <w:r>
-              <w:t>numero</w:t>
-            </w:r>
-            <w:proofErr w:type="gramEnd"/>
-            <w:r>
-              <w:t>": "993",</w:t>
-            </w:r>
-          </w:p>
-          <w:p>
-            <w:r>
-              <w:tab/>
-            </w:r>
-            <w:r>
-              <w:tab/>
-              <w:t>"complemento": "casa 2",</w:t>
-            </w:r>
-          </w:p>
-          <w:p>
-            <w:r>
-              <w:tab/>
-            </w:r>
-            <w:r>
-              <w:tab/>
-              <w:t>"cep": "06364550",</w:t>
-            </w:r>
-          </w:p>
-          <w:p>
-            <w:r>
-              <w:tab/>
-            </w:r>
-            <w:r>
-              <w:tab/>
-              <w:t>"cidade": "Carapicuiba",</w:t>
-            </w:r>
-          </w:p>
-          <w:p>
-            <w:r>
-              <w:tab/>
-            </w:r>
-            <w:r>
-              <w:tab/>
-              <w:t>"</w:t>
-            </w:r>
             <w:proofErr w:type="spellStart"/>
             <w:r>
               <w:t>bairro":"Jardim</w:t>
@@ -15994,13 +15525,8 @@
             </w:r>
             <w:proofErr w:type="spellEnd"/>
             <w:r>
-              <w:t xml:space="preserve"> </w:t>
-            </w:r>
-            <w:proofErr w:type="spellStart"/>
-            <w:r>
-              <w:t>Found</w:t>
-            </w:r>
-            <w:proofErr w:type="spellEnd"/>
+              <w:t xml:space="preserve"> Found</w:t>
+            </w:r>
           </w:p>
         </w:tc>
       </w:tr>
@@ -16141,15 +15667,7 @@
             </w:r>
             <w:proofErr w:type="spellEnd"/>
             <w:r>
-              <w:t xml:space="preserve"> </w:t>
-            </w:r>
-            <w:proofErr w:type="gramStart"/>
-            <w:r>
-              <w:t>por Consultar</w:t>
-            </w:r>
-            <w:proofErr w:type="gramEnd"/>
-            <w:r>
-              <w:t xml:space="preserve"> os dados de um </w:t>
+              <w:t xml:space="preserve"> por Consultar os dados de um </w:t>
             </w:r>
             <w:proofErr w:type="spellStart"/>
             <w:r>
@@ -16347,15 +15865,7 @@
           </w:p>
           <w:p>
             <w:r>
-              <w:t>        "</w:t>
-            </w:r>
-            <w:proofErr w:type="gramStart"/>
-            <w:r>
-              <w:t>numero</w:t>
-            </w:r>
-            <w:proofErr w:type="gramEnd"/>
-            <w:r>
-              <w:t>": "993",</w:t>
+              <w:t>        "numero": "993",</w:t>
             </w:r>
           </w:p>
           <w:p>
@@ -16545,15 +16055,7 @@
             </w:r>
             <w:proofErr w:type="spellEnd"/>
             <w:r>
-              <w:t xml:space="preserve"> </w:t>
-            </w:r>
-            <w:proofErr w:type="gramStart"/>
-            <w:r>
-              <w:t>por Consultar</w:t>
-            </w:r>
-            <w:proofErr w:type="gramEnd"/>
-            <w:r>
-              <w:t xml:space="preserve"> os dados de um </w:t>
+              <w:t xml:space="preserve"> por Consultar os dados de um </w:t>
             </w:r>
             <w:proofErr w:type="spellStart"/>
             <w:r>
@@ -17533,15 +17035,7 @@
             </w:r>
             <w:proofErr w:type="spellEnd"/>
             <w:r>
-              <w:t xml:space="preserve"> </w:t>
-            </w:r>
-            <w:proofErr w:type="gramStart"/>
-            <w:r>
-              <w:t>por Deletar</w:t>
-            </w:r>
-            <w:proofErr w:type="gramEnd"/>
-            <w:r>
-              <w:t xml:space="preserve"> um </w:t>
+              <w:t xml:space="preserve"> por Deletar um </w:t>
             </w:r>
             <w:proofErr w:type="spellStart"/>
             <w:r>
@@ -17813,15 +17307,7 @@
             </w:r>
             <w:proofErr w:type="spellEnd"/>
             <w:r>
-              <w:t xml:space="preserve"> </w:t>
-            </w:r>
-            <w:proofErr w:type="gramStart"/>
-            <w:r>
-              <w:t>por Deletar</w:t>
-            </w:r>
-            <w:proofErr w:type="gramEnd"/>
-            <w:r>
-              <w:t xml:space="preserve"> um </w:t>
+              <w:t xml:space="preserve"> por Deletar um </w:t>
             </w:r>
             <w:proofErr w:type="spellStart"/>
             <w:r>
@@ -18037,7 +17523,7 @@
       </w:r>
     </w:p>
     <w:p>
-      <w:hyperlink r:id="rId21" w:history="1">
+      <w:hyperlink r:id="rId20" w:history="1">
         <w:r>
           <w:rPr>
             <w:rStyle w:val="Hyperlink"/>
@@ -19277,6 +18763,7 @@
   <w:style w:type="character" w:default="1" w:styleId="Fontepargpadro">
     <w:name w:val="Default Paragraph Font"/>
     <w:uiPriority w:val="1"/>
+    <w:semiHidden/>
     <w:unhideWhenUsed/>
   </w:style>
   <w:style w:type="table" w:default="1" w:styleId="Tabelanormal">

</xml_diff>